<commit_message>
Revise gap note A: add Permenaker 5/2018 Lampiran 6 standards, figures, link ROSA to JSA note, add vault md builder
Co-Authored-By: Claude Sonnet 5.5 <noreply@anthropic.com>
</commit_message>
<xml_diff>
--- a/PPDS Okupasi Board Notes/Catatan Tambahan - Gap Kompilasi.docx
+++ b/PPDS Okupasi Board Notes/Catatan Tambahan - Gap Kompilasi.docx
@@ -24,7 +24,7 @@
           <w:i/>
           <w:sz w:val="19"/>
         </w:rPr>
-        <w:t>Catatan persiapan ujian board Kedokteran Okupasi (Sp.Ok). Disusun mengikuti 'Outline Catatan Tambahan - Gap Kompilasi' dari jawaban NotebookLM (notebook Board Notes - Gap), ditambah teks resmi Permenaker No. 5 Tahun 2018 beserta Lampiran 2 (pencahayaan) dan Lampiran 6 (standar ergonomi) yang dibaca langsung dari salinan teks karena salinan di notebook adalah hasil pindai. Standar Indonesia diutamakan; sumber internasional (Bodyspace, LaDou &amp; Harrison, OSHA) dipakai sebagai pelengkap dan ditandai. Tiap bab berdiri sendiri. Kotak kuning = clinical pearl; kotak merah muda = catatan sumber yang perlu diverifikasi. STATUS: bagian A selesai; bagian B sampai G dan tambahan H menyusul setelah format ini disetujui.</w:t>
+        <w:t>Catatan persiapan ujian board Kedokteran Okupasi (Sp.Ok). Disusun mengikuti 'Outline Catatan Tambahan - Gap Kompilasi' dari jawaban NotebookLM (notebook Board Notes - Gap), ditambah teks resmi Permenaker No. 5 Tahun 2018 beserta Lampiran 2 (pencahayaan) dan Lampiran 6 (standar ergonomi) yang dibaca langsung dari salinan teks karena salinan di notebook adalah hasil pindai. Standar Indonesia diutamakan; sumber internasional (Bodyspace, LaDou &amp; Harrison, OSHA) dipakai sebagai pelengkap dan ditandai. Yang sudah ada di catatan lama (misalnya ROSA, RULA, REBA di catatan JSA) tidak diulang dan hanya ditunjuk. Kotak kuning = clinical pearl; kotak merah muda = catatan sumber yang perlu diverifikasi. STATUS: bagian A selesai; bagian B sampai G dan tambahan H menyusul setelah format ini disetujui.</w:t>
       </w:r>
     </w:p>
     <w:p>
@@ -104,7 +104,7 @@
         <w:spacing w:after="0"/>
       </w:pPr>
       <w:r>
-        <w:t>A.8 Alat penilaian (ROSA dan lainnya)</w:t>
+        <w:t>A.8 Alat penilaian</w:t>
       </w:r>
     </w:p>
     <w:p>
@@ -724,7 +724,99 @@
         <w:pStyle w:val="Heading3"/>
       </w:pPr>
       <w:r>
-        <w:t>Jarak pandang</w:t>
+        <w:t>Standar Indonesia: Lampiran 6 Permenaker No. 5 Tahun 2018 (Ergonomi Komputer, monitor)</w:t>
+      </w:r>
+    </w:p>
+    <w:p>
+      <w:pPr>
+        <w:pStyle w:val="ListBullet"/>
+        <w:spacing w:after="20"/>
+      </w:pPr>
+      <w:r>
+        <w:rPr>
+          <w:b/>
+        </w:rPr>
+        <w:t>Jarak operator ke monitor 45 sampai 60 cm</w:t>
+      </w:r>
+      <w:r>
+        <w:rPr/>
+        <w:t>; terlalu dekat menyebabkan mata tegang, cepat lelah, dan potensi gangguan penglihatan.</w:t>
+      </w:r>
+    </w:p>
+    <w:p>
+      <w:pPr>
+        <w:pStyle w:val="ListBullet"/>
+        <w:spacing w:after="20"/>
+      </w:pPr>
+      <w:r>
+        <w:rPr>
+          <w:b/>
+        </w:rPr>
+        <w:t>Mata setinggi tepi atas layar</w:t>
+      </w:r>
+      <w:r>
+        <w:rPr/>
+        <w:t xml:space="preserve"> (sekitar 5 sampai 6 cm di bawah tepi atas casing monitor). Monitor terlalu rendah menyebabkan nyeri leher dan bahu.</w:t>
+      </w:r>
+    </w:p>
+    <w:p>
+      <w:pPr>
+        <w:pStyle w:val="ListBullet"/>
+        <w:spacing w:after="20"/>
+      </w:pPr>
+      <w:r>
+        <w:rPr/>
+        <w:t xml:space="preserve">Monitor </w:t>
+      </w:r>
+      <w:r>
+        <w:rPr>
+          <w:b/>
+        </w:rPr>
+        <w:t>tepat lurus di depan</w:t>
+      </w:r>
+      <w:r>
+        <w:rPr/>
+        <w:t>, jangan memaksa kepala menoleh; posisi layar meminimalkan pantulan lampu atau jendela; filter layar boleh dipakai.</w:t>
+      </w:r>
+    </w:p>
+    <w:p>
+      <w:pPr>
+        <w:pStyle w:val="ListBullet"/>
+        <w:spacing w:after="20"/>
+      </w:pPr>
+      <w:r>
+        <w:rPr>
+          <w:b/>
+        </w:rPr>
+        <w:t>Kacamata baca (bifokal, progresif): turunkan monitor lebih rendah.</w:t>
+      </w:r>
+    </w:p>
+    <w:p>
+      <w:pPr>
+        <w:pStyle w:val="ListBullet"/>
+        <w:spacing w:after="20"/>
+      </w:pPr>
+      <w:r>
+        <w:rPr/>
+        <w:t xml:space="preserve">Dokumen sumber diletakkan </w:t>
+      </w:r>
+      <w:r>
+        <w:rPr>
+          <w:b/>
+        </w:rPr>
+        <w:t>dekat monitor</w:t>
+      </w:r>
+      <w:r>
+        <w:rPr/>
+        <w:t xml:space="preserve"> (di bawah atau di samping) untuk mengurangi nyeri leher akibat menoleh. Kecerahan dan warna layar disetel nyaman (tidak terlalu redup atau terang); layar dibersihkan.</w:t>
+      </w:r>
+    </w:p>
+    <w:p>
+      <w:pPr>
+        <w:pStyle w:val="Heading3"/>
+      </w:pPr>
+      <w:r>
+        <w:t>Jarak pandang (perbandingan sumber)</w:t>
       </w:r>
     </w:p>
     <w:tbl>
@@ -789,6 +881,44 @@
             <w:r/>
             <w:r>
               <w:rPr>
+                <w:b/>
+                <w:sz w:val="18"/>
+              </w:rPr>
+              <w:t>Permenaker 5/2018 Lampiran 6 (Indonesia)</w:t>
+            </w:r>
+          </w:p>
+        </w:tc>
+        <w:tc>
+          <w:tcPr>
+            <w:tcW w:type="dxa" w:w="8050"/>
+          </w:tcPr>
+          <w:p>
+            <w:pPr>
+              <w:spacing w:after="0"/>
+            </w:pPr>
+            <w:r/>
+            <w:r>
+              <w:rPr>
+                <w:b/>
+                <w:sz w:val="18"/>
+              </w:rPr>
+              <w:t>45 sampai 60 cm</w:t>
+            </w:r>
+          </w:p>
+        </w:tc>
+      </w:tr>
+      <w:tr>
+        <w:tc>
+          <w:tcPr>
+            <w:tcW w:type="dxa" w:w="1701"/>
+          </w:tcPr>
+          <w:p>
+            <w:pPr>
+              <w:spacing w:after="0"/>
+            </w:pPr>
+            <w:r/>
+            <w:r>
+              <w:rPr>
                 <w:sz w:val="18"/>
               </w:rPr>
               <w:t>Batas minimum mutlak (Bodyspace)</w:t>
@@ -1000,7 +1130,7 @@
               <w:rPr>
                 <w:sz w:val="19"/>
               </w:rPr>
-              <w:t>CATATAN SUMBER: NotebookLM menulis rentang LaDou sebagai "48 sampai 72 cm (20 sampai 30 inci)". Konversinya tidak cocok (20 sampai 30 inci = 51 sampai 76 cm). Rentang OSHA 20 sampai 40 inci ada di outline [W1] tetapi tidak muncul dalam jawaban NotebookLM; cek halaman OSHA. Untuk menjawab ujian, aman dengan: minimal 50 cm, ideal sekitar 50 sampai 100 cm (kisaran jarak lengan), paling nyaman sekitar 75 sampai 80 cm.</w:t>
+              <w:t>CATATAN SUMBER: NotebookLM menulis rentang LaDou sebagai "48 sampai 72 cm (20 sampai 30 inci)". Konversinya tidak cocok (20 sampai 30 inci = 51 sampai 76 cm). Rentang OSHA 20 sampai 40 inci ada di outline [W1] tetapi tidak muncul dalam jawaban NotebookLM; cek halaman OSHA. Untuk menjawab ujian: bila soal berbasis regulasi Indonesia, jawab 45 sampai 60 cm (Lampiran 6). Bila soal berbasis literatur internasional, jawab minimal 50 cm, kisaran 50 sampai 100 cm (OSHA), paling nyaman 75 sampai 80 cm. Sebut sumbernya, karena angkanya berbeda.</w:t>
             </w:r>
           </w:p>
         </w:tc>
@@ -1562,7 +1692,7 @@
               <w:rPr>
                 <w:sz w:val="19"/>
               </w:rPr>
-              <w:t>Clinical pearl: Hafalan cepat untuk soal: tepi atas layar setinggi mata atau sedikit di bawahnya; layar tegak lurus jendela; jarak minimal 50 cm; bifokal = layar lebih rendah (30 sampai 45 derajat). Silau langsung = pekerja menghadap jendela, silau pantulan = pekerja membelakangi jendela.</w:t>
+              <w:t>Clinical pearl: Hafalan cepat untuk soal: tepi atas layar setinggi mata atau sedikit di bawahnya; layar tegak lurus jendela; jarak 45 sampai 60 cm (Lampiran 6) atau minimal 50 cm (literatur); bifokal = layar lebih rendah (30 sampai 45 derajat). Silau langsung = pekerja menghadap jendela, silau pantulan = pekerja membelakangi jendela.</w:t>
             </w:r>
           </w:p>
         </w:tc>
@@ -1586,7 +1716,159 @@
         <w:pStyle w:val="Heading3"/>
       </w:pPr>
       <w:r>
-        <w:t>Pergelangan tangan dan wrist rest</w:t>
+        <w:t>Standar Indonesia: Lampiran 6 Permenaker No. 5 Tahun 2018 (Ergonomi Komputer)</w:t>
+      </w:r>
+    </w:p>
+    <w:p>
+      <w:pPr>
+        <w:pStyle w:val="ListBullet"/>
+        <w:spacing w:after="20"/>
+      </w:pPr>
+      <w:r>
+        <w:rPr>
+          <w:b/>
+        </w:rPr>
+        <w:t>Keyboard</w:t>
+      </w:r>
+      <w:r>
+        <w:rPr/>
+        <w:t xml:space="preserve">: sejajar arah layar; lengan </w:t>
+      </w:r>
+      <w:r>
+        <w:rPr>
+          <w:b/>
+        </w:rPr>
+        <w:t>relaks, lengan bawah horizontal</w:t>
+      </w:r>
+      <w:r>
+        <w:rPr/>
+        <w:t xml:space="preserve">; </w:t>
+      </w:r>
+      <w:r>
+        <w:rPr>
+          <w:b/>
+        </w:rPr>
+        <w:t>pundak relaks, tidak terangkat</w:t>
+      </w:r>
+      <w:r>
+        <w:rPr/>
+        <w:t xml:space="preserve">; </w:t>
+      </w:r>
+      <w:r>
+        <w:rPr>
+          <w:b/>
+        </w:rPr>
+        <w:t>pergelangan lurus, tidak menekuk ke atas atau bawah</w:t>
+      </w:r>
+      <w:r>
+        <w:rPr/>
+        <w:t xml:space="preserve">; tangan ikut bergeser kiri-kanan supaya jari tidak dipaksa meraih tombol; tombol ditekan halus, tidak dipukul; keyboard ergonomik bila perlu; manfaatkan </w:t>
+      </w:r>
+      <w:r>
+        <w:rPr>
+          <w:i/>
+        </w:rPr>
+        <w:t>shortcut</w:t>
+      </w:r>
+      <w:r>
+        <w:rPr/>
+        <w:t xml:space="preserve"> dan </w:t>
+      </w:r>
+      <w:r>
+        <w:rPr>
+          <w:i/>
+        </w:rPr>
+        <w:t>macro</w:t>
+      </w:r>
+      <w:r>
+        <w:rPr/>
+        <w:t xml:space="preserve"> untuk mengurangi penekanan tombol.</w:t>
+      </w:r>
+    </w:p>
+    <w:p>
+      <w:pPr>
+        <w:pStyle w:val="ListBullet"/>
+        <w:spacing w:after="20"/>
+      </w:pPr>
+      <w:r>
+        <w:rPr>
+          <w:b/>
+        </w:rPr>
+        <w:t>Mouse</w:t>
+      </w:r>
+      <w:r>
+        <w:rPr/>
+        <w:t xml:space="preserve">: ukuran sesuai tangan; </w:t>
+      </w:r>
+      <w:r>
+        <w:rPr>
+          <w:b/>
+        </w:rPr>
+        <w:t>dekat dan di permukaan yang sama dengan keyboard</w:t>
+      </w:r>
+      <w:r>
+        <w:rPr/>
+        <w:t xml:space="preserve"> supaya tidak meregang; pegang ringan, klik tegas; </w:t>
+      </w:r>
+      <w:r>
+        <w:rPr>
+          <w:b/>
+        </w:rPr>
+        <w:t>gerakkan dengan lengan, jangan hanya pergelangan</w:t>
+      </w:r>
+      <w:r>
+        <w:rPr/>
+        <w:t>; jangan menumpukan pergelangan atau lengan bawah di meja saat menggerakkan mouse; kabel jangan terlalu panjang atau pakai nirkabel; pada laptop kurangi touchpad (pakai mouse).</w:t>
+      </w:r>
+    </w:p>
+    <w:p>
+      <w:pPr>
+        <w:pStyle w:val="ListBullet"/>
+        <w:spacing w:after="20"/>
+      </w:pPr>
+      <w:r>
+        <w:rPr>
+          <w:b/>
+        </w:rPr>
+        <w:t>Duduk</w:t>
+      </w:r>
+      <w:r>
+        <w:rPr/>
+        <w:t>: paha horizontal, punggung bawah tersandar; hindari duduk di ujung kursi (beri bantal lumbal bila kursi kurang dapat diatur); telapak kaki rata di lantai (bila tidak, kursi terlalu tinggi, solusinya penyangga kaki); ubah posisi duduk selama bekerja.</w:t>
+      </w:r>
+    </w:p>
+    <w:p>
+      <w:pPr>
+        <w:pStyle w:val="ListBullet"/>
+        <w:spacing w:after="20"/>
+      </w:pPr>
+      <w:r>
+        <w:rPr>
+          <w:b/>
+        </w:rPr>
+        <w:t>Meja</w:t>
+      </w:r>
+      <w:r>
+        <w:rPr/>
+        <w:t xml:space="preserve">: cukup luas untuk CPU, monitor, keyboard, mouse, printer, penyangga dokumen; alat yang sering dipakai (mouse, telepon) di posisi paling mudah dijangkau; </w:t>
+      </w:r>
+      <w:r>
+        <w:rPr>
+          <w:b/>
+        </w:rPr>
+        <w:t>laptop jangan dipaksa di bawah atau di lantai</w:t>
+      </w:r>
+      <w:r>
+        <w:rPr/>
+        <w:t xml:space="preserve"> sehingga badan membungkuk.</w:t>
+      </w:r>
+    </w:p>
+    <w:p>
+      <w:pPr>
+        <w:pStyle w:val="Heading3"/>
+      </w:pPr>
+      <w:r>
+        <w:t>Pergelangan tangan dan wrist rest (literatur)</w:t>
       </w:r>
     </w:p>
     <w:p>
@@ -2423,6 +2705,603 @@
           <w:b/>
         </w:rPr>
         <w:t>645 mm</w:t>
+      </w:r>
+      <w:r>
+        <w:rPr/>
+        <w:t>.</w:t>
+      </w:r>
+    </w:p>
+    <w:p>
+      <w:pPr>
+        <w:keepNext/>
+        <w:jc w:val="center"/>
+      </w:pPr>
+      <w:r>
+        <w:drawing>
+          <wp:inline xmlns:a="http://schemas.openxmlformats.org/drawingml/2006/main" xmlns:pic="http://schemas.openxmlformats.org/drawingml/2006/picture">
+            <wp:extent cx="4680000" cy="2983978"/>
+            <wp:docPr id="1" name="Picture 1"/>
+            <wp:cNvGraphicFramePr>
+              <a:graphicFrameLocks noChangeAspect="1"/>
+            </wp:cNvGraphicFramePr>
+            <a:graphic>
+              <a:graphicData uri="http://schemas.openxmlformats.org/drawingml/2006/picture">
+                <pic:pic>
+                  <pic:nvPicPr>
+                    <pic:cNvPr id="0" name="A_gambar-B3_desain-stasiun-kerja-duduk.png"/>
+                    <pic:cNvPicPr/>
+                  </pic:nvPicPr>
+                  <pic:blipFill>
+                    <a:blip r:embed="rId10"/>
+                    <a:stretch>
+                      <a:fillRect/>
+                    </a:stretch>
+                  </pic:blipFill>
+                  <pic:spPr>
+                    <a:xfrm>
+                      <a:off x="0" y="0"/>
+                      <a:ext cx="4680000" cy="2983978"/>
+                    </a:xfrm>
+                    <a:prstGeom prst="rect"/>
+                  </pic:spPr>
+                </pic:pic>
+              </a:graphicData>
+            </a:graphic>
+          </wp:inline>
+        </w:drawing>
+      </w:r>
+    </w:p>
+    <w:p>
+      <w:pPr>
+        <w:jc w:val="center"/>
+      </w:pPr>
+      <w:r>
+        <w:rPr>
+          <w:i/>
+          <w:sz w:val="17"/>
+        </w:rPr>
+        <w:t>Gambar B3 Lampiran 6 Permenaker 5/2018: desain stasiun kerja duduk. A tinggi meja; B tinggi visual (mata duduk); C tebal meja; D dan H kedalaman ruang kaki; E lebar ruang bebas di bawah meja; F jarak dudukan ke bawah meja (tebal paha); G letak peralatan yang sering dipakai (panjang tangan); I panjang ruang kaki; J tinggi ruang bebas bawah meja.</w:t>
+      </w:r>
+    </w:p>
+    <w:p>
+      <w:pPr>
+        <w:pStyle w:val="Heading3"/>
+      </w:pPr>
+      <w:r>
+        <w:t>Desain kursi kantor menurut Lampiran 6 (Tabel B6.1)</w:t>
+      </w:r>
+    </w:p>
+    <w:tbl>
+      <w:tblPr>
+        <w:tblStyle w:val="TableGrid"/>
+        <w:tblW w:type="auto" w:w="0"/>
+        <w:tblLook w:firstColumn="1" w:firstRow="1" w:lastColumn="0" w:lastRow="0" w:noHBand="0" w:noVBand="1" w:val="04A0"/>
+      </w:tblPr>
+      <w:tblGrid>
+        <w:gridCol w:w="4876"/>
+        <w:gridCol w:w="4876"/>
+      </w:tblGrid>
+      <w:tr>
+        <w:tc>
+          <w:tcPr>
+            <w:tcW w:type="dxa" w:w="1701"/>
+            <w:shd w:val="clear" w:color="auto" w:fill="DCE6F1"/>
+          </w:tcPr>
+          <w:p>
+            <w:pPr>
+              <w:spacing w:after="0"/>
+            </w:pPr>
+            <w:r/>
+            <w:r>
+              <w:rPr>
+                <w:b/>
+                <w:sz w:val="18"/>
+              </w:rPr>
+              <w:t>Komponen</w:t>
+            </w:r>
+          </w:p>
+        </w:tc>
+        <w:tc>
+          <w:tcPr>
+            <w:tcW w:type="dxa" w:w="8050"/>
+            <w:shd w:val="clear" w:color="auto" w:fill="DCE6F1"/>
+          </w:tcPr>
+          <w:p>
+            <w:pPr>
+              <w:spacing w:after="0"/>
+            </w:pPr>
+            <w:r/>
+            <w:r>
+              <w:rPr>
+                <w:b/>
+                <w:sz w:val="18"/>
+              </w:rPr>
+              <w:t>Dimensi dan persentil acuan</w:t>
+            </w:r>
+          </w:p>
+        </w:tc>
+      </w:tr>
+      <w:tr>
+        <w:tc>
+          <w:tcPr>
+            <w:tcW w:type="dxa" w:w="1701"/>
+          </w:tcPr>
+          <w:p>
+            <w:pPr>
+              <w:spacing w:after="0"/>
+            </w:pPr>
+            <w:r/>
+            <w:r>
+              <w:rPr>
+                <w:b/>
+                <w:sz w:val="18"/>
+              </w:rPr>
+              <w:t>Tinggi kursi</w:t>
+            </w:r>
+          </w:p>
+        </w:tc>
+        <w:tc>
+          <w:tcPr>
+            <w:tcW w:type="dxa" w:w="8050"/>
+          </w:tcPr>
+          <w:p>
+            <w:pPr>
+              <w:spacing w:after="0"/>
+            </w:pPr>
+            <w:r/>
+            <w:r>
+              <w:rPr>
+                <w:b/>
+                <w:sz w:val="18"/>
+              </w:rPr>
+              <w:t>Tinggi tungkai bawah (popliteal) P5</w:t>
+            </w:r>
+            <w:r>
+              <w:rPr>
+                <w:sz w:val="18"/>
+              </w:rPr>
+              <w:t xml:space="preserve"> bila tanpa injakan kaki; </w:t>
+            </w:r>
+            <w:r>
+              <w:rPr>
+                <w:b/>
+                <w:sz w:val="18"/>
+              </w:rPr>
+              <w:t>P95</w:t>
+            </w:r>
+            <w:r>
+              <w:rPr>
+                <w:sz w:val="18"/>
+              </w:rPr>
+              <w:t xml:space="preserve"> bila memakai injakan kaki. Kursi yang dapat disetel: rentang </w:t>
+            </w:r>
+            <w:r>
+              <w:rPr>
+                <w:b/>
+                <w:sz w:val="18"/>
+              </w:rPr>
+              <w:t>P5 sampai P95</w:t>
+            </w:r>
+          </w:p>
+        </w:tc>
+      </w:tr>
+      <w:tr>
+        <w:tc>
+          <w:tcPr>
+            <w:tcW w:type="dxa" w:w="1701"/>
+          </w:tcPr>
+          <w:p>
+            <w:pPr>
+              <w:spacing w:after="0"/>
+            </w:pPr>
+            <w:r/>
+            <w:r>
+              <w:rPr>
+                <w:b/>
+                <w:sz w:val="18"/>
+              </w:rPr>
+              <w:t>Panjang dudukan</w:t>
+            </w:r>
+          </w:p>
+        </w:tc>
+        <w:tc>
+          <w:tcPr>
+            <w:tcW w:type="dxa" w:w="8050"/>
+          </w:tcPr>
+          <w:p>
+            <w:pPr>
+              <w:spacing w:after="0"/>
+            </w:pPr>
+            <w:r/>
+            <w:r>
+              <w:rPr>
+                <w:b/>
+                <w:sz w:val="18"/>
+              </w:rPr>
+              <w:t>Panjang tungkai atas P5</w:t>
+            </w:r>
+            <w:r>
+              <w:rPr>
+                <w:sz w:val="18"/>
+              </w:rPr>
+              <w:t xml:space="preserve"> (bokong sampai lipat lutut)</w:t>
+            </w:r>
+          </w:p>
+        </w:tc>
+      </w:tr>
+      <w:tr>
+        <w:tc>
+          <w:tcPr>
+            <w:tcW w:type="dxa" w:w="1701"/>
+          </w:tcPr>
+          <w:p>
+            <w:pPr>
+              <w:spacing w:after="0"/>
+            </w:pPr>
+            <w:r/>
+            <w:r>
+              <w:rPr>
+                <w:b/>
+                <w:sz w:val="18"/>
+              </w:rPr>
+              <w:t>Lebar dudukan</w:t>
+            </w:r>
+          </w:p>
+        </w:tc>
+        <w:tc>
+          <w:tcPr>
+            <w:tcW w:type="dxa" w:w="8050"/>
+          </w:tcPr>
+          <w:p>
+            <w:pPr>
+              <w:spacing w:after="0"/>
+            </w:pPr>
+            <w:r/>
+            <w:r>
+              <w:rPr>
+                <w:b/>
+                <w:sz w:val="18"/>
+              </w:rPr>
+              <w:t>Lebar pinggul P95</w:t>
+            </w:r>
+            <w:r>
+              <w:rPr>
+                <w:sz w:val="18"/>
+              </w:rPr>
+              <w:t xml:space="preserve"> bila tanpa sandaran tangan; </w:t>
+            </w:r>
+            <w:r>
+              <w:rPr>
+                <w:b/>
+                <w:sz w:val="18"/>
+              </w:rPr>
+              <w:t>lebar bahu P95</w:t>
+            </w:r>
+            <w:r>
+              <w:rPr>
+                <w:sz w:val="18"/>
+              </w:rPr>
+              <w:t xml:space="preserve"> bila memakai sandaran tangan</w:t>
+            </w:r>
+          </w:p>
+        </w:tc>
+      </w:tr>
+      <w:tr>
+        <w:tc>
+          <w:tcPr>
+            <w:tcW w:type="dxa" w:w="1701"/>
+          </w:tcPr>
+          <w:p>
+            <w:pPr>
+              <w:spacing w:after="0"/>
+            </w:pPr>
+            <w:r/>
+            <w:r>
+              <w:rPr>
+                <w:b/>
+                <w:sz w:val="18"/>
+              </w:rPr>
+              <w:t>Sandaran punggung</w:t>
+            </w:r>
+          </w:p>
+        </w:tc>
+        <w:tc>
+          <w:tcPr>
+            <w:tcW w:type="dxa" w:w="8050"/>
+          </w:tcPr>
+          <w:p>
+            <w:pPr>
+              <w:spacing w:after="0"/>
+            </w:pPr>
+            <w:r/>
+            <w:r>
+              <w:rPr>
+                <w:b/>
+                <w:sz w:val="18"/>
+              </w:rPr>
+              <w:t>Tinggi bahu duduk P5</w:t>
+            </w:r>
+            <w:r>
+              <w:rPr>
+                <w:sz w:val="18"/>
+              </w:rPr>
+              <w:t>; bentuk mengikuti struktur tulang belakang</w:t>
+            </w:r>
+          </w:p>
+        </w:tc>
+      </w:tr>
+      <w:tr>
+        <w:tc>
+          <w:tcPr>
+            <w:tcW w:type="dxa" w:w="1701"/>
+          </w:tcPr>
+          <w:p>
+            <w:pPr>
+              <w:spacing w:after="0"/>
+            </w:pPr>
+            <w:r/>
+            <w:r>
+              <w:rPr>
+                <w:b/>
+                <w:sz w:val="18"/>
+              </w:rPr>
+              <w:t>Sandaran tangan</w:t>
+            </w:r>
+          </w:p>
+        </w:tc>
+        <w:tc>
+          <w:tcPr>
+            <w:tcW w:type="dxa" w:w="8050"/>
+          </w:tcPr>
+          <w:p>
+            <w:pPr>
+              <w:spacing w:after="0"/>
+            </w:pPr>
+            <w:r/>
+            <w:r>
+              <w:rPr>
+                <w:sz w:val="18"/>
+              </w:rPr>
+              <w:t xml:space="preserve">Jarak antar tepi dalam </w:t>
+            </w:r>
+            <w:r>
+              <w:rPr>
+                <w:b/>
+                <w:sz w:val="18"/>
+              </w:rPr>
+              <w:t>lebih besar dari lebar pinggul dan tidak melebihi lebar bahu</w:t>
+            </w:r>
+            <w:r>
+              <w:rPr>
+                <w:sz w:val="18"/>
+              </w:rPr>
+              <w:t xml:space="preserve">; tinggi = </w:t>
+            </w:r>
+            <w:r>
+              <w:rPr>
+                <w:b/>
+                <w:sz w:val="18"/>
+              </w:rPr>
+              <w:t>tinggi siku P95</w:t>
+            </w:r>
+            <w:r>
+              <w:rPr>
+                <w:sz w:val="18"/>
+              </w:rPr>
+              <w:t xml:space="preserve">; panjang = </w:t>
+            </w:r>
+            <w:r>
+              <w:rPr>
+                <w:b/>
+                <w:sz w:val="18"/>
+              </w:rPr>
+              <w:t>panjang lengan bawah P95</w:t>
+            </w:r>
+            <w:r>
+              <w:rPr>
+                <w:sz w:val="18"/>
+              </w:rPr>
+              <w:t xml:space="preserve">; jarak antar tepi dalam = </w:t>
+            </w:r>
+            <w:r>
+              <w:rPr>
+                <w:b/>
+                <w:sz w:val="18"/>
+              </w:rPr>
+              <w:t>lebar bahu P95</w:t>
+            </w:r>
+          </w:p>
+        </w:tc>
+      </w:tr>
+      <w:tr>
+        <w:tc>
+          <w:tcPr>
+            <w:tcW w:type="dxa" w:w="1701"/>
+          </w:tcPr>
+          <w:p>
+            <w:pPr>
+              <w:spacing w:after="0"/>
+            </w:pPr>
+            <w:r/>
+            <w:r>
+              <w:rPr>
+                <w:b/>
+                <w:sz w:val="18"/>
+              </w:rPr>
+              <w:t>Alas duduk</w:t>
+            </w:r>
+          </w:p>
+        </w:tc>
+        <w:tc>
+          <w:tcPr>
+            <w:tcW w:type="dxa" w:w="8050"/>
+          </w:tcPr>
+          <w:p>
+            <w:pPr>
+              <w:spacing w:after="0"/>
+            </w:pPr>
+            <w:r/>
+            <w:r>
+              <w:rPr>
+                <w:sz w:val="18"/>
+              </w:rPr>
+              <w:t>Horizontal; pada pekerjaan yang tidak perlu membungkuk, boleh miring ke belakang</w:t>
+            </w:r>
+          </w:p>
+        </w:tc>
+      </w:tr>
+    </w:tbl>
+    <w:p>
+      <w:pPr>
+        <w:spacing w:after="40"/>
+      </w:pPr>
+    </w:p>
+    <w:tbl>
+      <w:tblPr>
+        <w:tblStyle w:val="TableGrid"/>
+        <w:tblW w:type="auto" w:w="0"/>
+        <w:tblLook w:firstColumn="1" w:firstRow="1" w:lastColumn="0" w:lastRow="0" w:noHBand="0" w:noVBand="1" w:val="04A0"/>
+      </w:tblPr>
+      <w:tblGrid>
+        <w:gridCol w:w="9752"/>
+      </w:tblGrid>
+      <w:tr>
+        <w:tc>
+          <w:tcPr>
+            <w:tcW w:type="dxa" w:w="9752"/>
+            <w:shd w:val="clear" w:color="auto" w:fill="FDE0DC"/>
+          </w:tcPr>
+          <w:p>
+            <w:r/>
+            <w:r>
+              <w:rPr>
+                <w:sz w:val="19"/>
+              </w:rPr>
+              <w:t>CATATAN SUMBER: Teks Lampiran 6 tidak konsisten dalam satu halaman: daftar pengantar menyebut tinggi bahu duduk P95 dan tinggi siku duduk P50, sedangkan Tabel B6.1 menyebut tinggi bahu duduk P5 untuk sandaran punggung dan tinggi siku P95 untuk sandaran tangan. Untuk ujian, hafal isi tabel B6.1 dan sebut bahwa data persentil ditentukan oleh dimensi yang membatasi (ekstrem).</w:t>
+            </w:r>
+          </w:p>
+        </w:tc>
+      </w:tr>
+    </w:tbl>
+    <w:p>
+      <w:pPr>
+        <w:spacing w:after="40"/>
+      </w:pPr>
+    </w:p>
+    <w:p>
+      <w:pPr>
+        <w:pStyle w:val="Heading3"/>
+      </w:pPr>
+      <w:r>
+        <w:t>Desain meja kerja menurut Lampiran 6 (Tabel B6.2)</w:t>
+      </w:r>
+    </w:p>
+    <w:p>
+      <w:pPr>
+        <w:pStyle w:val="ListBullet"/>
+        <w:spacing w:after="20"/>
+      </w:pPr>
+      <w:r>
+        <w:rPr/>
+        <w:t xml:space="preserve">Tinggi permukaan atas meja berdasarkan </w:t>
+      </w:r>
+      <w:r>
+        <w:rPr>
+          <w:b/>
+        </w:rPr>
+        <w:t>tinggi siku</w:t>
+      </w:r>
+      <w:r>
+        <w:rPr/>
+        <w:t xml:space="preserve">, disesuaikan sikap tubuh; acuan persentil </w:t>
+      </w:r>
+      <w:r>
+        <w:rPr>
+          <w:b/>
+        </w:rPr>
+        <w:t>P50</w:t>
+      </w:r>
+      <w:r>
+        <w:rPr/>
+        <w:t>.</w:t>
+      </w:r>
+    </w:p>
+    <w:p>
+      <w:pPr>
+        <w:pStyle w:val="ListBullet"/>
+        <w:spacing w:after="20"/>
+      </w:pPr>
+      <w:r>
+        <w:rPr>
+          <w:b/>
+        </w:rPr>
+        <w:t>Sikap berdiri</w:t>
+      </w:r>
+      <w:r>
+        <w:rPr/>
+        <w:t xml:space="preserve"> (Tabel B6.2): pekerjaan teliti 10 sampai 20 cm </w:t>
+      </w:r>
+      <w:r>
+        <w:rPr>
+          <w:b/>
+        </w:rPr>
+        <w:t>di atas</w:t>
+      </w:r>
+      <w:r>
+        <w:rPr/>
+        <w:t xml:space="preserve"> tinggi siku; pekerjaan yang memerlukan penekanan tangan 10 sampai 20 cm </w:t>
+      </w:r>
+      <w:r>
+        <w:rPr>
+          <w:b/>
+        </w:rPr>
+        <w:t>di bawah</w:t>
+      </w:r>
+      <w:r>
+        <w:rPr/>
+        <w:t xml:space="preserve"> tinggi siku. (Bagian B4 lampiran yang sama menyebut 5 sampai 10 cm di atas untuk teliti, 5 sampai 10 cm di bawah untuk kerja manual, dan 10 sampai 15 cm di bawah untuk penekanan kuat; sebut kedua bila ditanya.)</w:t>
+      </w:r>
+    </w:p>
+    <w:p>
+      <w:pPr>
+        <w:pStyle w:val="ListBullet"/>
+        <w:spacing w:after="20"/>
+      </w:pPr>
+      <w:r>
+        <w:rPr>
+          <w:b/>
+        </w:rPr>
+        <w:t>Sikap duduk</w:t>
+      </w:r>
+      <w:r>
+        <w:rPr/>
+        <w:t xml:space="preserve">: tinggi berdasarkan tinggi siku duduk dan jenis pekerjaan. </w:t>
+      </w:r>
+      <w:r>
+        <w:rPr>
+          <w:b/>
+        </w:rPr>
+        <w:t>Tebal daun meja</w:t>
+      </w:r>
+      <w:r>
+        <w:rPr/>
+        <w:t xml:space="preserve"> harus memberi kebebasan gerak kaki; permukaan </w:t>
+      </w:r>
+      <w:r>
+        <w:rPr>
+          <w:b/>
+        </w:rPr>
+        <w:t>rata dan tidak menyilaukan</w:t>
+      </w:r>
+      <w:r>
+        <w:rPr/>
+        <w:t xml:space="preserve">; </w:t>
+      </w:r>
+      <w:r>
+        <w:rPr>
+          <w:b/>
+        </w:rPr>
+        <w:t>lebar meja tidak melebihi jangkauan tangan ke depan (P5)</w:t>
       </w:r>
       <w:r>
         <w:rPr/>
@@ -3972,6 +4851,58 @@
       <w:pPr>
         <w:spacing w:after="40"/>
       </w:pPr>
+    </w:p>
+    <w:p>
+      <w:pPr>
+        <w:keepNext/>
+        <w:jc w:val="center"/>
+      </w:pPr>
+      <w:r>
+        <w:drawing>
+          <wp:inline xmlns:a="http://schemas.openxmlformats.org/drawingml/2006/main" xmlns:pic="http://schemas.openxmlformats.org/drawingml/2006/picture">
+            <wp:extent cx="3240000" cy="4289797"/>
+            <wp:docPr id="2" name="Picture 2"/>
+            <wp:cNvGraphicFramePr>
+              <a:graphicFrameLocks noChangeAspect="1"/>
+            </wp:cNvGraphicFramePr>
+            <a:graphic>
+              <a:graphicData uri="http://schemas.openxmlformats.org/drawingml/2006/picture">
+                <pic:pic>
+                  <pic:nvPicPr>
+                    <pic:cNvPr id="0" name="A_lampiran2_baris-kantor-lux.png"/>
+                    <pic:cNvPicPr/>
+                  </pic:nvPicPr>
+                  <pic:blipFill>
+                    <a:blip r:embed="rId11"/>
+                    <a:stretch>
+                      <a:fillRect/>
+                    </a:stretch>
+                  </pic:blipFill>
+                  <pic:spPr>
+                    <a:xfrm>
+                      <a:off x="0" y="0"/>
+                      <a:ext cx="3240000" cy="4289797"/>
+                    </a:xfrm>
+                    <a:prstGeom prst="rect"/>
+                  </pic:spPr>
+                </pic:pic>
+              </a:graphicData>
+            </a:graphic>
+          </wp:inline>
+        </w:drawing>
+      </w:r>
+    </w:p>
+    <w:p>
+      <w:pPr>
+        <w:jc w:val="center"/>
+      </w:pPr>
+      <w:r>
+        <w:rPr>
+          <w:i/>
+          <w:sz w:val="17"/>
+        </w:rPr>
+        <w:t>Lampiran 2 Permenaker 5/2018 (halaman 54): baris 6 (kerja kantor berganti menulis dan membaca, arsip: 300 lux), baris 7 (akuntan, steno, mengetik, kantor lama: 500 sampai 1.000 lux), baris 8 (1.000 lux).</w:t>
+      </w:r>
     </w:p>
     <w:p>
       <w:pPr>
@@ -7332,6 +8263,58 @@
     </w:p>
     <w:p>
       <w:pPr>
+        <w:keepNext/>
+        <w:jc w:val="center"/>
+      </w:pPr>
+      <w:r>
+        <w:drawing>
+          <wp:inline xmlns:a="http://schemas.openxmlformats.org/drawingml/2006/main" xmlns:pic="http://schemas.openxmlformats.org/drawingml/2006/picture">
+            <wp:extent cx="4680000" cy="2809180"/>
+            <wp:docPr id="3" name="Picture 3"/>
+            <wp:cNvGraphicFramePr>
+              <a:graphicFrameLocks noChangeAspect="1"/>
+            </wp:cNvGraphicFramePr>
+            <a:graphic>
+              <a:graphicData uri="http://schemas.openxmlformats.org/drawingml/2006/picture">
+                <pic:pic>
+                  <pic:nvPicPr>
+                    <pic:cNvPr id="0" name="A_gambar-B2_zona-jangkauan-stasiun-duduk.png"/>
+                    <pic:cNvPicPr/>
+                  </pic:nvPicPr>
+                  <pic:blipFill>
+                    <a:blip r:embed="rId12"/>
+                    <a:stretch>
+                      <a:fillRect/>
+                    </a:stretch>
+                  </pic:blipFill>
+                  <pic:spPr>
+                    <a:xfrm>
+                      <a:off x="0" y="0"/>
+                      <a:ext cx="4680000" cy="2809180"/>
+                    </a:xfrm>
+                    <a:prstGeom prst="rect"/>
+                  </pic:spPr>
+                </pic:pic>
+              </a:graphicData>
+            </a:graphic>
+          </wp:inline>
+        </w:drawing>
+      </w:r>
+    </w:p>
+    <w:p>
+      <w:pPr>
+        <w:jc w:val="center"/>
+      </w:pPr>
+      <w:r>
+        <w:rPr>
+          <w:i/>
+          <w:sz w:val="17"/>
+        </w:rPr>
+        <w:t>Gambar B2 Lampiran 6 Permenaker 5/2018: zona jangkauan stasiun kerja duduk. A area sering dipakai (25 cm); B area jarang dipakai (50 cm); C letak peralatan; D jangkauan optimal (100 cm); E jangkauan maksimal (160 cm).</w:t>
+      </w:r>
+    </w:p>
+    <w:p>
+      <w:pPr>
         <w:pStyle w:val="ListBullet"/>
         <w:spacing w:after="20"/>
       </w:pPr>
@@ -7980,7 +8963,7 @@
         <w:pStyle w:val="Heading2"/>
       </w:pPr>
       <w:r>
-        <w:t>A.8 Alat penilaian (ROSA dan lainnya)</w:t>
+        <w:t>A.8 Alat penilaian</w:t>
       </w:r>
     </w:p>
     <w:p>
@@ -7988,7 +8971,31 @@
         <w:pStyle w:val="Heading3"/>
       </w:pPr>
       <w:r>
-        <w:t>Alat penilaian ergonomi kantor</w:t>
+        <w:t>Sudah ada di catatan lama (tidak diulang)</w:t>
+      </w:r>
+    </w:p>
+    <w:p>
+      <w:pPr>
+        <w:pStyle w:val="ListBullet"/>
+        <w:spacing w:after="20"/>
+      </w:pPr>
+      <w:r>
+        <w:rPr>
+          <w:b/>
+        </w:rPr>
+        <w:t>ROSA, RULA, REBA, OWAS, NIOSH Lifting Equation, OCRA, BRIEF Survey</w:t>
+      </w:r>
+      <w:r>
+        <w:rPr/>
+        <w:t>: lihat catatan 'Catatan_JSA - Job Safety Analysis', bagian B (ROSA ada di bagian 9: rumus, action level skor 5 atau lebih, reliabilitas, evaluasi longitudinal) dan bagian C (matriks pembeda antar alat).</w:t>
+      </w:r>
+    </w:p>
+    <w:p>
+      <w:pPr>
+        <w:pStyle w:val="Heading3"/>
+      </w:pPr>
+      <w:r>
+        <w:t>Alat tambahan yang belum ada di catatan lama</w:t>
       </w:r>
     </w:p>
     <w:tbl>
@@ -7998,15 +9005,14 @@
         <w:tblLook w:firstColumn="1" w:firstRow="1" w:lastColumn="0" w:lastRow="0" w:noHBand="0" w:noVBand="1" w:val="04A0"/>
       </w:tblPr>
       <w:tblGrid>
-        <w:gridCol w:w="2438"/>
-        <w:gridCol w:w="2438"/>
-        <w:gridCol w:w="2438"/>
-        <w:gridCol w:w="2438"/>
+        <w:gridCol w:w="3251"/>
+        <w:gridCol w:w="3251"/>
+        <w:gridCol w:w="3251"/>
       </w:tblGrid>
       <w:tr>
         <w:tc>
           <w:tcPr>
-            <w:tcW w:type="dxa" w:w="2438"/>
+            <w:tcW w:type="dxa" w:w="3251"/>
             <w:shd w:val="clear" w:color="auto" w:fill="DCE6F1"/>
           </w:tcPr>
           <w:p>
@@ -8017,7 +9023,7 @@
             <w:r>
               <w:rPr>
                 <w:b/>
-                <w:sz w:val="16"/>
+                <w:sz w:val="18"/>
               </w:rPr>
               <w:t>Alat</w:t>
             </w:r>
@@ -8025,7 +9031,7 @@
         </w:tc>
         <w:tc>
           <w:tcPr>
-            <w:tcW w:type="dxa" w:w="2438"/>
+            <w:tcW w:type="dxa" w:w="3251"/>
             <w:shd w:val="clear" w:color="auto" w:fill="DCE6F1"/>
           </w:tcPr>
           <w:p>
@@ -8036,7 +9042,7 @@
             <w:r>
               <w:rPr>
                 <w:b/>
-                <w:sz w:val="16"/>
+                <w:sz w:val="18"/>
               </w:rPr>
               <w:t>Isi</w:t>
             </w:r>
@@ -8044,7 +9050,7 @@
         </w:tc>
         <w:tc>
           <w:tcPr>
-            <w:tcW w:type="dxa" w:w="2438"/>
+            <w:tcW w:type="dxa" w:w="3251"/>
             <w:shd w:val="clear" w:color="auto" w:fill="DCE6F1"/>
           </w:tcPr>
           <w:p>
@@ -8055,16 +9061,17 @@
             <w:r>
               <w:rPr>
                 <w:b/>
-                <w:sz w:val="16"/>
+                <w:sz w:val="18"/>
               </w:rPr>
               <w:t>Skor dan interpretasi</w:t>
             </w:r>
           </w:p>
         </w:tc>
+      </w:tr>
+      <w:tr>
         <w:tc>
           <w:tcPr>
-            <w:tcW w:type="dxa" w:w="2438"/>
-            <w:shd w:val="clear" w:color="auto" w:fill="DCE6F1"/>
+            <w:tcW w:type="dxa" w:w="3251"/>
           </w:tcPr>
           <w:p>
             <w:pPr>
@@ -8074,9 +9081,50 @@
             <w:r>
               <w:rPr>
                 <w:b/>
-                <w:sz w:val="16"/>
-              </w:rPr>
-              <w:t>Ada di sumber?</w:t>
+                <w:sz w:val="18"/>
+              </w:rPr>
+              <w:t>Checklist OSHA computer workstation</w:t>
+            </w:r>
+          </w:p>
+        </w:tc>
+        <w:tc>
+          <w:tcPr>
+            <w:tcW w:type="dxa" w:w="3251"/>
+          </w:tcPr>
+          <w:p>
+            <w:pPr>
+              <w:spacing w:after="0"/>
+            </w:pPr>
+            <w:r/>
+            <w:r>
+              <w:rPr>
+                <w:sz w:val="18"/>
+              </w:rPr>
+              <w:t>Kriteria: tepi atas monitor setinggi atau sedikit di bawah mata, kepala dan leher seimbang, punggung bawah tersangga, bahu rileks, siku dekat badan dan tersangga, pergelangan lurus, telapak kaki rata, ruang cukup untuk keyboard dan mouse</w:t>
+            </w:r>
+          </w:p>
+        </w:tc>
+        <w:tc>
+          <w:tcPr>
+            <w:tcW w:type="dxa" w:w="3251"/>
+          </w:tcPr>
+          <w:p>
+            <w:pPr>
+              <w:spacing w:after="0"/>
+            </w:pPr>
+            <w:r/>
+            <w:r>
+              <w:rPr>
+                <w:b/>
+                <w:sz w:val="18"/>
+              </w:rPr>
+              <w:t>Kualitatif, tanpa skor</w:t>
+            </w:r>
+            <w:r>
+              <w:rPr>
+                <w:sz w:val="18"/>
+              </w:rPr>
+              <w:t>; setiap kriteria yang tidak terpenuhi = bahaya ergonomi yang perlu dikoreksi</w:t>
             </w:r>
           </w:p>
         </w:tc>
@@ -8084,7 +9132,7 @@
       <w:tr>
         <w:tc>
           <w:tcPr>
-            <w:tcW w:type="dxa" w:w="2438"/>
+            <w:tcW w:type="dxa" w:w="3251"/>
           </w:tcPr>
           <w:p>
             <w:pPr>
@@ -8094,34 +9142,15 @@
             <w:r>
               <w:rPr>
                 <w:b/>
-                <w:sz w:val="16"/>
-              </w:rPr>
-              <w:t>ROSA</w:t>
-            </w:r>
-            <w:r>
-              <w:rPr>
-                <w:sz w:val="16"/>
-              </w:rPr>
-              <w:t xml:space="preserve"> (</w:t>
-            </w:r>
-            <w:r>
-              <w:rPr>
-                <w:i/>
-                <w:sz w:val="16"/>
-              </w:rPr>
-              <w:t>Rapid Office Strain Assessment</w:t>
-            </w:r>
-            <w:r>
-              <w:rPr>
-                <w:sz w:val="16"/>
-              </w:rPr>
-              <w:t>)</w:t>
+                <w:sz w:val="18"/>
+              </w:rPr>
+              <w:t>Checklist VDU HSE (Inggris)</w:t>
             </w:r>
           </w:p>
         </w:tc>
         <w:tc>
           <w:tcPr>
-            <w:tcW w:type="dxa" w:w="2438"/>
+            <w:tcW w:type="dxa" w:w="3251"/>
           </w:tcPr>
           <w:p>
             <w:pPr>
@@ -8130,54 +9159,28 @@
             <w:r/>
             <w:r>
               <w:rPr>
-                <w:sz w:val="16"/>
-              </w:rPr>
-              <w:t xml:space="preserve">Menilai tiga bagian: </w:t>
-            </w:r>
-            <w:r>
-              <w:rPr>
-                <w:b/>
-                <w:sz w:val="16"/>
-              </w:rPr>
-              <w:t>kursi</w:t>
-            </w:r>
-            <w:r>
-              <w:rPr>
-                <w:sz w:val="16"/>
-              </w:rPr>
-              <w:t xml:space="preserve"> (tinggi, kedalaman dudukan, sandaran lengan, sandaran punggung), </w:t>
-            </w:r>
-            <w:r>
-              <w:rPr>
-                <w:b/>
-                <w:sz w:val="16"/>
-              </w:rPr>
-              <w:t>monitor dan telepon</w:t>
-            </w:r>
-            <w:r>
-              <w:rPr>
-                <w:sz w:val="16"/>
-              </w:rPr>
-              <w:t xml:space="preserve">, </w:t>
-            </w:r>
-            <w:r>
-              <w:rPr>
-                <w:b/>
-                <w:sz w:val="16"/>
-              </w:rPr>
-              <w:t>mouse dan keyboard</w:t>
-            </w:r>
-            <w:r>
-              <w:rPr>
-                <w:sz w:val="16"/>
-              </w:rPr>
-              <w:t>; ditambah durasi pemakaian per bagian</w:t>
+                <w:sz w:val="18"/>
+              </w:rPr>
+              <w:t xml:space="preserve">Instrumen penilaian risiko berdasar </w:t>
+            </w:r>
+            <w:r>
+              <w:rPr>
+                <w:i/>
+                <w:sz w:val="18"/>
+              </w:rPr>
+              <w:t>Display Screen Equipment Regulations</w:t>
+            </w:r>
+            <w:r>
+              <w:rPr>
+                <w:sz w:val="18"/>
+              </w:rPr>
+              <w:t xml:space="preserve"> (EU Directive 90/270/EEC): stasiun kerja, meja, kursi, perangkat input, pencahayaan, kenyamanan</w:t>
             </w:r>
           </w:p>
         </w:tc>
         <w:tc>
           <w:tcPr>
-            <w:tcW w:type="dxa" w:w="2438"/>
+            <w:tcW w:type="dxa" w:w="3251"/>
           </w:tcPr>
           <w:p>
             <w:pPr>
@@ -8186,41 +9189,17 @@
             <w:r/>
             <w:r>
               <w:rPr>
-                <w:sz w:val="16"/>
-              </w:rPr>
-              <w:t xml:space="preserve">Skor akhir </w:t>
-            </w:r>
-            <w:r>
-              <w:rPr>
-                <w:b/>
-                <w:sz w:val="16"/>
-              </w:rPr>
-              <w:t>1 sampai 10</w:t>
-            </w:r>
-            <w:r>
-              <w:rPr>
-                <w:sz w:val="16"/>
-              </w:rPr>
-              <w:t xml:space="preserve">; skor </w:t>
-            </w:r>
-            <w:r>
-              <w:rPr>
-                <w:b/>
-                <w:sz w:val="16"/>
-              </w:rPr>
-              <w:t>5 atau lebih</w:t>
-            </w:r>
-            <w:r>
-              <w:rPr>
-                <w:sz w:val="16"/>
-              </w:rPr>
-              <w:t xml:space="preserve"> dianggap perlu penilaian lanjutan dan perubahan</w:t>
+                <w:sz w:val="18"/>
+              </w:rPr>
+              <w:t>Kualitatif</w:t>
             </w:r>
           </w:p>
         </w:tc>
+      </w:tr>
+      <w:tr>
         <w:tc>
           <w:tcPr>
-            <w:tcW w:type="dxa" w:w="2438"/>
+            <w:tcW w:type="dxa" w:w="3251"/>
           </w:tcPr>
           <w:p>
             <w:pPr>
@@ -8230,15 +9209,49 @@
             <w:r>
               <w:rPr>
                 <w:b/>
-                <w:sz w:val="16"/>
-              </w:rPr>
-              <w:t>Tidak ada</w:t>
-            </w:r>
-            <w:r>
-              <w:rPr>
-                <w:sz w:val="16"/>
-              </w:rPr>
-              <w:t xml:space="preserve"> di sumber notebook</w:t>
+                <w:sz w:val="18"/>
+              </w:rPr>
+              <w:t>TCO "Office Checker"</w:t>
+            </w:r>
+            <w:r>
+              <w:rPr>
+                <w:sz w:val="18"/>
+              </w:rPr>
+              <w:t xml:space="preserve"> (Andersson dkk. 2000)</w:t>
+            </w:r>
+          </w:p>
+        </w:tc>
+        <w:tc>
+          <w:tcPr>
+            <w:tcW w:type="dxa" w:w="3251"/>
+          </w:tcPr>
+          <w:p>
+            <w:pPr>
+              <w:spacing w:after="0"/>
+            </w:pPr>
+            <w:r/>
+            <w:r>
+              <w:rPr>
+                <w:sz w:val="18"/>
+              </w:rPr>
+              <w:t>Evaluasi tempat kerja kantor</w:t>
+            </w:r>
+          </w:p>
+        </w:tc>
+        <w:tc>
+          <w:tcPr>
+            <w:tcW w:type="dxa" w:w="3251"/>
+          </w:tcPr>
+          <w:p>
+            <w:pPr>
+              <w:spacing w:after="0"/>
+            </w:pPr>
+            <w:r/>
+            <w:r>
+              <w:rPr>
+                <w:sz w:val="18"/>
+              </w:rPr>
+              <w:t>Kualitatif</w:t>
             </w:r>
           </w:p>
         </w:tc>
@@ -8246,7 +9259,7 @@
       <w:tr>
         <w:tc>
           <w:tcPr>
-            <w:tcW w:type="dxa" w:w="2438"/>
+            <w:tcW w:type="dxa" w:w="3251"/>
           </w:tcPr>
           <w:p>
             <w:pPr>
@@ -8256,15 +9269,21 @@
             <w:r>
               <w:rPr>
                 <w:b/>
-                <w:sz w:val="16"/>
-              </w:rPr>
-              <w:t>Checklist OSHA computer workstation</w:t>
+                <w:sz w:val="18"/>
+              </w:rPr>
+              <w:t>Strain Index</w:t>
+            </w:r>
+            <w:r>
+              <w:rPr>
+                <w:sz w:val="18"/>
+              </w:rPr>
+              <w:t xml:space="preserve"> (Moore &amp; Garg)</w:t>
             </w:r>
           </w:p>
         </w:tc>
         <w:tc>
           <w:tcPr>
-            <w:tcW w:type="dxa" w:w="2438"/>
+            <w:tcW w:type="dxa" w:w="3251"/>
           </w:tcPr>
           <w:p>
             <w:pPr>
@@ -8273,15 +9292,15 @@
             <w:r/>
             <w:r>
               <w:rPr>
-                <w:sz w:val="16"/>
-              </w:rPr>
-              <w:t>Daftar kriteria: tepi atas monitor setinggi atau sedikit di bawah mata, kepala dan leher seimbang, punggung bawah tersangga, bahu rileks, siku dekat badan dan tersangga, pergelangan lurus, telapak kaki rata, ruang cukup untuk keyboard dan mouse</w:t>
+                <w:sz w:val="18"/>
+              </w:rPr>
+              <w:t>Enam variabel ekstremitas atas distal: intensitas, durasi, frekuensi pengerahan, postur tangan/pergelangan, kecepatan, durasi per hari</w:t>
             </w:r>
           </w:p>
         </w:tc>
         <w:tc>
           <w:tcPr>
-            <w:tcW w:type="dxa" w:w="2438"/>
+            <w:tcW w:type="dxa" w:w="3251"/>
           </w:tcPr>
           <w:p>
             <w:pPr>
@@ -8290,22 +9309,43 @@
             <w:r/>
             <w:r>
               <w:rPr>
+                <w:sz w:val="18"/>
+              </w:rPr>
+              <w:t xml:space="preserve">Variabel </w:t>
+            </w:r>
+            <w:r>
+              <w:rPr>
                 <w:b/>
-                <w:sz w:val="16"/>
-              </w:rPr>
-              <w:t>Kualitatif, tanpa skor</w:t>
-            </w:r>
-            <w:r>
-              <w:rPr>
-                <w:sz w:val="16"/>
-              </w:rPr>
-              <w:t>; setiap kriteria yang tidak terpenuhi = bahaya ergonomi yang perlu dikoreksi</w:t>
+                <w:sz w:val="18"/>
+              </w:rPr>
+              <w:t>dikalikan</w:t>
+            </w:r>
+            <w:r>
+              <w:rPr>
+                <w:sz w:val="18"/>
+              </w:rPr>
+              <w:t xml:space="preserve">; skor </w:t>
+            </w:r>
+            <w:r>
+              <w:rPr>
+                <w:b/>
+                <w:sz w:val="18"/>
+              </w:rPr>
+              <w:t>7 atau lebih</w:t>
+            </w:r>
+            <w:r>
+              <w:rPr>
+                <w:sz w:val="18"/>
+              </w:rPr>
+              <w:t xml:space="preserve"> = risiko tinggi, picu investigasi dan intervensi</w:t>
             </w:r>
           </w:p>
         </w:tc>
+      </w:tr>
+      <w:tr>
         <w:tc>
           <w:tcPr>
-            <w:tcW w:type="dxa" w:w="2438"/>
+            <w:tcW w:type="dxa" w:w="3251"/>
           </w:tcPr>
           <w:p>
             <w:pPr>
@@ -8314,17 +9354,16 @@
             <w:r/>
             <w:r>
               <w:rPr>
-                <w:sz w:val="16"/>
-              </w:rPr>
-              <w:t>Ada (OSHA eTool)</w:t>
+                <w:b/>
+                <w:sz w:val="18"/>
+              </w:rPr>
+              <w:t>ACGIH Hand Activity Level (HAL)</w:t>
             </w:r>
           </w:p>
         </w:tc>
-      </w:tr>
-      <w:tr>
         <w:tc>
           <w:tcPr>
-            <w:tcW w:type="dxa" w:w="2438"/>
+            <w:tcW w:type="dxa" w:w="3251"/>
           </w:tcPr>
           <w:p>
             <w:pPr>
@@ -8334,15 +9373,47 @@
             <w:r>
               <w:rPr>
                 <w:b/>
-                <w:sz w:val="16"/>
-              </w:rPr>
-              <w:t>Checklist VDU HSE (Inggris)</w:t>
+                <w:sz w:val="18"/>
+              </w:rPr>
+              <w:t>HAL</w:t>
+            </w:r>
+            <w:r>
+              <w:rPr>
+                <w:sz w:val="18"/>
+              </w:rPr>
+              <w:t xml:space="preserve"> 0 sampai 10 (frekuensi gerak dan </w:t>
+            </w:r>
+            <w:r>
+              <w:rPr>
+                <w:i/>
+                <w:sz w:val="18"/>
+              </w:rPr>
+              <w:t>duty cycle</w:t>
+            </w:r>
+            <w:r>
+              <w:rPr>
+                <w:sz w:val="18"/>
+              </w:rPr>
+              <w:t xml:space="preserve">) dan </w:t>
+            </w:r>
+            <w:r>
+              <w:rPr>
+                <w:b/>
+                <w:sz w:val="18"/>
+              </w:rPr>
+              <w:t>Normalized Peak Force</w:t>
+            </w:r>
+            <w:r>
+              <w:rPr>
+                <w:sz w:val="18"/>
+              </w:rPr>
+              <w:t xml:space="preserve"> 0 sampai 10</w:t>
             </w:r>
           </w:p>
         </w:tc>
         <w:tc>
           <w:tcPr>
-            <w:tcW w:type="dxa" w:w="2438"/>
+            <w:tcW w:type="dxa" w:w="3251"/>
           </w:tcPr>
           <w:p>
             <w:pPr>
@@ -8351,347 +9422,16 @@
             <w:r/>
             <w:r>
               <w:rPr>
-                <w:sz w:val="16"/>
-              </w:rPr>
-              <w:t xml:space="preserve">Instrumen penilaian risiko berdasar </w:t>
-            </w:r>
-            <w:r>
-              <w:rPr>
-                <w:i/>
-                <w:sz w:val="16"/>
-              </w:rPr>
-              <w:t>Display Screen Equipment Regulations</w:t>
-            </w:r>
-            <w:r>
-              <w:rPr>
-                <w:sz w:val="16"/>
-              </w:rPr>
-              <w:t xml:space="preserve"> (EU Directive 90/270/EEC): stasiun kerja, meja, kursi, input, pencahayaan, kenyamanan</w:t>
-            </w:r>
-          </w:p>
-        </w:tc>
-        <w:tc>
-          <w:tcPr>
-            <w:tcW w:type="dxa" w:w="2438"/>
-          </w:tcPr>
-          <w:p>
-            <w:pPr>
-              <w:spacing w:after="0"/>
-            </w:pPr>
-            <w:r/>
-            <w:r>
-              <w:rPr>
-                <w:sz w:val="16"/>
-              </w:rPr>
-              <w:t>Kualitatif</w:t>
-            </w:r>
-          </w:p>
-        </w:tc>
-        <w:tc>
-          <w:tcPr>
-            <w:tcW w:type="dxa" w:w="2438"/>
-          </w:tcPr>
-          <w:p>
-            <w:pPr>
-              <w:spacing w:after="0"/>
-            </w:pPr>
-            <w:r/>
-            <w:r>
-              <w:rPr>
-                <w:sz w:val="16"/>
-              </w:rPr>
-              <w:t>Ada (Bodyspace)</w:t>
-            </w:r>
-          </w:p>
-        </w:tc>
-      </w:tr>
-      <w:tr>
-        <w:tc>
-          <w:tcPr>
-            <w:tcW w:type="dxa" w:w="2438"/>
-          </w:tcPr>
-          <w:p>
-            <w:pPr>
-              <w:spacing w:after="0"/>
-            </w:pPr>
-            <w:r/>
+                <w:sz w:val="18"/>
+              </w:rPr>
+              <w:t xml:space="preserve">Diplot pada grafik </w:t>
+            </w:r>
             <w:r>
               <w:rPr>
                 <w:b/>
-                <w:sz w:val="16"/>
-              </w:rPr>
-              <w:t>TCO "Office Checker"</w:t>
-            </w:r>
-            <w:r>
-              <w:rPr>
-                <w:sz w:val="16"/>
-              </w:rPr>
-              <w:t xml:space="preserve"> (Andersson dkk. 2000)</w:t>
-            </w:r>
-          </w:p>
-        </w:tc>
-        <w:tc>
-          <w:tcPr>
-            <w:tcW w:type="dxa" w:w="2438"/>
-          </w:tcPr>
-          <w:p>
-            <w:pPr>
-              <w:spacing w:after="0"/>
-            </w:pPr>
-            <w:r/>
-            <w:r>
-              <w:rPr>
-                <w:sz w:val="16"/>
-              </w:rPr>
-              <w:t>Evaluasi tempat kerja kantor</w:t>
-            </w:r>
-          </w:p>
-        </w:tc>
-        <w:tc>
-          <w:tcPr>
-            <w:tcW w:type="dxa" w:w="2438"/>
-          </w:tcPr>
-          <w:p>
-            <w:pPr>
-              <w:spacing w:after="0"/>
-            </w:pPr>
-            <w:r/>
-            <w:r>
-              <w:rPr>
-                <w:sz w:val="16"/>
-              </w:rPr>
-              <w:t>Kualitatif</w:t>
-            </w:r>
-          </w:p>
-        </w:tc>
-        <w:tc>
-          <w:tcPr>
-            <w:tcW w:type="dxa" w:w="2438"/>
-          </w:tcPr>
-          <w:p>
-            <w:pPr>
-              <w:spacing w:after="0"/>
-            </w:pPr>
-            <w:r/>
-            <w:r>
-              <w:rPr>
-                <w:sz w:val="16"/>
-              </w:rPr>
-              <w:t>Disebut (Bodyspace)</w:t>
-            </w:r>
-          </w:p>
-        </w:tc>
-      </w:tr>
-      <w:tr>
-        <w:tc>
-          <w:tcPr>
-            <w:tcW w:type="dxa" w:w="2438"/>
-          </w:tcPr>
-          <w:p>
-            <w:pPr>
-              <w:spacing w:after="0"/>
-            </w:pPr>
-            <w:r/>
-            <w:r>
-              <w:rPr>
-                <w:b/>
-                <w:sz w:val="16"/>
-              </w:rPr>
-              <w:t>Strain Index</w:t>
-            </w:r>
-            <w:r>
-              <w:rPr>
-                <w:sz w:val="16"/>
-              </w:rPr>
-              <w:t xml:space="preserve"> (Moore &amp; Garg)</w:t>
-            </w:r>
-          </w:p>
-        </w:tc>
-        <w:tc>
-          <w:tcPr>
-            <w:tcW w:type="dxa" w:w="2438"/>
-          </w:tcPr>
-          <w:p>
-            <w:pPr>
-              <w:spacing w:after="0"/>
-            </w:pPr>
-            <w:r/>
-            <w:r>
-              <w:rPr>
-                <w:sz w:val="16"/>
-              </w:rPr>
-              <w:t>Enam variabel ekstremitas atas distal: intensitas, durasi, frekuensi pengerahan, postur tangan/pergelangan, kecepatan, durasi per hari</w:t>
-            </w:r>
-          </w:p>
-        </w:tc>
-        <w:tc>
-          <w:tcPr>
-            <w:tcW w:type="dxa" w:w="2438"/>
-          </w:tcPr>
-          <w:p>
-            <w:pPr>
-              <w:spacing w:after="0"/>
-            </w:pPr>
-            <w:r/>
-            <w:r>
-              <w:rPr>
-                <w:sz w:val="16"/>
-              </w:rPr>
-              <w:t xml:space="preserve">Variabel </w:t>
-            </w:r>
-            <w:r>
-              <w:rPr>
-                <w:b/>
-                <w:sz w:val="16"/>
-              </w:rPr>
-              <w:t>dikalikan</w:t>
-            </w:r>
-            <w:r>
-              <w:rPr>
-                <w:sz w:val="16"/>
-              </w:rPr>
-              <w:t xml:space="preserve">; skor </w:t>
-            </w:r>
-            <w:r>
-              <w:rPr>
-                <w:b/>
-                <w:sz w:val="16"/>
-              </w:rPr>
-              <w:t>7 atau lebih</w:t>
-            </w:r>
-            <w:r>
-              <w:rPr>
-                <w:sz w:val="16"/>
-              </w:rPr>
-              <w:t xml:space="preserve"> = risiko tinggi, picu investigasi dan intervensi</w:t>
-            </w:r>
-          </w:p>
-        </w:tc>
-        <w:tc>
-          <w:tcPr>
-            <w:tcW w:type="dxa" w:w="2438"/>
-          </w:tcPr>
-          <w:p>
-            <w:pPr>
-              <w:spacing w:after="0"/>
-            </w:pPr>
-            <w:r/>
-            <w:r>
-              <w:rPr>
-                <w:sz w:val="16"/>
-              </w:rPr>
-              <w:t>Ada (LaDou)</w:t>
-            </w:r>
-          </w:p>
-        </w:tc>
-      </w:tr>
-      <w:tr>
-        <w:tc>
-          <w:tcPr>
-            <w:tcW w:type="dxa" w:w="2438"/>
-          </w:tcPr>
-          <w:p>
-            <w:pPr>
-              <w:spacing w:after="0"/>
-            </w:pPr>
-            <w:r/>
-            <w:r>
-              <w:rPr>
-                <w:b/>
-                <w:sz w:val="16"/>
-              </w:rPr>
-              <w:t>ACGIH Hand Activity Level (HAL)</w:t>
-            </w:r>
-          </w:p>
-        </w:tc>
-        <w:tc>
-          <w:tcPr>
-            <w:tcW w:type="dxa" w:w="2438"/>
-          </w:tcPr>
-          <w:p>
-            <w:pPr>
-              <w:spacing w:after="0"/>
-            </w:pPr>
-            <w:r/>
-            <w:r>
-              <w:rPr>
-                <w:b/>
-                <w:sz w:val="16"/>
-              </w:rPr>
-              <w:t>HAL</w:t>
-            </w:r>
-            <w:r>
-              <w:rPr>
-                <w:sz w:val="16"/>
-              </w:rPr>
-              <w:t xml:space="preserve"> 0 sampai 10 (frekuensi gerak dan </w:t>
-            </w:r>
-            <w:r>
-              <w:rPr>
-                <w:i/>
-                <w:sz w:val="16"/>
-              </w:rPr>
-              <w:t>duty cycle</w:t>
-            </w:r>
-            <w:r>
-              <w:rPr>
-                <w:sz w:val="16"/>
-              </w:rPr>
-              <w:t xml:space="preserve">) dan </w:t>
-            </w:r>
-            <w:r>
-              <w:rPr>
-                <w:b/>
-                <w:sz w:val="16"/>
-              </w:rPr>
-              <w:t>Normalized Peak Force</w:t>
-            </w:r>
-            <w:r>
-              <w:rPr>
-                <w:sz w:val="16"/>
-              </w:rPr>
-              <w:t xml:space="preserve"> 0 sampai 10</w:t>
-            </w:r>
-          </w:p>
-        </w:tc>
-        <w:tc>
-          <w:tcPr>
-            <w:tcW w:type="dxa" w:w="2438"/>
-          </w:tcPr>
-          <w:p>
-            <w:pPr>
-              <w:spacing w:after="0"/>
-            </w:pPr>
-            <w:r/>
-            <w:r>
-              <w:rPr>
-                <w:sz w:val="16"/>
-              </w:rPr>
-              <w:t xml:space="preserve">Diplot pada grafik </w:t>
-            </w:r>
-            <w:r>
-              <w:rPr>
-                <w:b/>
-                <w:sz w:val="16"/>
+                <w:sz w:val="18"/>
               </w:rPr>
               <w:t>TLV dan Action Limit</w:t>
-            </w:r>
-          </w:p>
-        </w:tc>
-        <w:tc>
-          <w:tcPr>
-            <w:tcW w:type="dxa" w:w="2438"/>
-          </w:tcPr>
-          <w:p>
-            <w:pPr>
-              <w:spacing w:after="0"/>
-            </w:pPr>
-            <w:r/>
-            <w:r>
-              <w:rPr>
-                <w:sz w:val="16"/>
-              </w:rPr>
-              <w:t>Ada (ACGIH)</w:t>
             </w:r>
           </w:p>
         </w:tc>
@@ -8701,22 +9441,6 @@
       <w:pPr>
         <w:spacing w:after="40"/>
       </w:pPr>
-    </w:p>
-    <w:p>
-      <w:pPr>
-        <w:pStyle w:val="ListBullet"/>
-        <w:spacing w:after="20"/>
-      </w:pPr>
-      <w:r>
-        <w:rPr>
-          <w:b/>
-        </w:rPr>
-        <w:t>REBA dan RULA</w:t>
-      </w:r>
-      <w:r>
-        <w:rPr/>
-        <w:t>: metodenya tidak dirinci di sumber notebook.</w:t>
-      </w:r>
     </w:p>
     <w:tbl>
       <w:tblPr>
@@ -8731,7 +9455,7 @@
         <w:tc>
           <w:tcPr>
             <w:tcW w:type="dxa" w:w="9752"/>
-            <w:shd w:val="clear" w:color="auto" w:fill="FDE0DC"/>
+            <w:shd w:val="clear" w:color="auto" w:fill="FFF2CC"/>
           </w:tcPr>
           <w:p>
             <w:r/>
@@ -8739,7 +9463,7 @@
               <w:rPr>
                 <w:sz w:val="19"/>
               </w:rPr>
-              <w:t>CATATAN SUMBER: Baris ROSA (komponen dan skor 1 sampai 10, ambang 5) berasal dari pengetahuan umum penulis (Sonne, Villalta &amp; Andrews 2012), bukan dari sumber di notebook; NotebookLM menyatakan ROSA, REBA, dan rincian RULA tidak ada di sumber. Verifikasi ke artikel asli sebelum dihafal.</w:t>
+              <w:t>Clinical pearl: Untuk soal "alat penilaian ergonomi kantor": ROSA (kursi, monitor/telepon, mouse/keyboard; skor akhir 1 sampai 10, action level 5 atau lebih). Checklist OSHA dan HSE bersifat kualitatif tanpa skor.</w:t>
             </w:r>
           </w:p>
         </w:tc>
@@ -8845,9 +9569,16 @@
             <w:r/>
             <w:r>
               <w:rPr>
-                <w:sz w:val="18"/>
-              </w:rPr>
-              <w:t>Minimal 50 cm; kisaran jarak lengan sekitar 50 sampai 100 cm (OSHA); paling nyaman sekitar 75 sampai 80 cm (Bodyspace); LaDou 48 sampai 72 cm</w:t>
+                <w:b/>
+                <w:sz w:val="18"/>
+              </w:rPr>
+              <w:t>45 sampai 60 cm (Permenaker 5/2018 Lampiran 6)</w:t>
+            </w:r>
+            <w:r>
+              <w:rPr>
+                <w:sz w:val="18"/>
+              </w:rPr>
+              <w:t>; literatur: minimal 50 cm, kisaran 50 sampai 100 cm (OSHA), paling nyaman 75 sampai 80 cm (Bodyspace), LaDou 48 sampai 72 cm</w:t>
             </w:r>
           </w:p>
         </w:tc>
@@ -9787,9 +10518,16 @@
             <w:r/>
             <w:r>
               <w:rPr>
-                <w:sz w:val="18"/>
-              </w:rPr>
-              <w:t>Lampiran Permenaker 5/2018 (lux, antropometri, stasiun kerja) tidak terbaca di notebook karena salinan hasil pindai</w:t>
+                <w:b/>
+                <w:sz w:val="18"/>
+              </w:rPr>
+              <w:t>Audit tumpang tindih</w:t>
+            </w:r>
+            <w:r>
+              <w:rPr>
+                <w:sz w:val="18"/>
+              </w:rPr>
+              <w:t xml:space="preserve"> dengan 8 catatan lama (2026-10-19)</w:t>
             </w:r>
           </w:p>
         </w:tc>
@@ -9806,7 +10544,7 @@
               <w:rPr>
                 <w:sz w:val="18"/>
               </w:rPr>
-              <w:t>Dibaca dari salinan teks (llg-bwi.org) dan dicek ke gambar halaman. Tabel lux dan isi Lampiran 6 bersumber dari sana. Sebaiknya salinan itu juga ditambahkan ke notebook</w:t>
+              <w:t>Bagian A tidak diulang bila sudah ada: ROSA/RULA/REBA/OWAS/NIOSH/OCRA/BRIEF ada di catatan 'Catatan_JSA - Job Safety Analysis'; A.8 hanya memuat alat yang belum ada. A.1 sampai A.7 belum ada di catatan lama (hanya hit sambil lalu di Muskuloskeletal, mis. micro-break dan keyboard tray)</w:t>
             </w:r>
           </w:p>
         </w:tc>
@@ -9825,7 +10563,7 @@
               <w:rPr>
                 <w:sz w:val="18"/>
               </w:rPr>
-              <w:t>NotebookLM merujuk Pasal 8 ayat 1 huruf g untuk pencahayaan</w:t>
+              <w:t>Lampiran Permenaker 5/2018 (lux, antropometri, stasiun kerja, ergonomi komputer) tidak terbaca di notebook karena salinan hasil pindai</w:t>
             </w:r>
           </w:p>
         </w:tc>
@@ -9842,7 +10580,7 @@
               <w:rPr>
                 <w:sz w:val="18"/>
               </w:rPr>
-              <w:t>Teks resmi: pencahayaan huruf h (Pasal 16 ayat 1 salah rujuk ke huruf g)</w:t>
+              <w:t>Dibaca dari salinan teks (llg-bwi.org) dan dicek ke gambar halaman. Tabel lux, Lampiran 6 (A, B, B6), dan gambar B2, B3 bersumber dari sana. Sebaiknya salinan itu ditambahkan ke notebook</w:t>
             </w:r>
           </w:p>
         </w:tc>
@@ -9861,7 +10599,7 @@
               <w:rPr>
                 <w:sz w:val="18"/>
               </w:rPr>
-              <w:t>Rentang jarak LaDou ditulis "48 sampai 72 cm (20 sampai 30 inci)"</w:t>
+              <w:t>NotebookLM merujuk Pasal 8 ayat 1 huruf g untuk pencahayaan</w:t>
             </w:r>
           </w:p>
         </w:tc>
@@ -9878,7 +10616,7 @@
               <w:rPr>
                 <w:sz w:val="18"/>
               </w:rPr>
-              <w:t>Konversi tidak cocok; dicatat, dan jawaban aman diberikan</w:t>
+              <w:t>Teks resmi: pencahayaan huruf h (Pasal 16 ayat 1 salah rujuk ke huruf g)</w:t>
             </w:r>
           </w:p>
         </w:tc>
@@ -9897,7 +10635,20 @@
               <w:rPr>
                 <w:sz w:val="18"/>
               </w:rPr>
-              <w:t>Rentang OSHA 50 sampai 100 cm (20 sampai 40 inci) dari outline</w:t>
+              <w:t xml:space="preserve">Lampiran 6 menyebut jarak monitor </w:t>
+            </w:r>
+            <w:r>
+              <w:rPr>
+                <w:b/>
+                <w:sz w:val="18"/>
+              </w:rPr>
+              <w:t>45 sampai 60 cm</w:t>
+            </w:r>
+            <w:r>
+              <w:rPr>
+                <w:sz w:val="18"/>
+              </w:rPr>
+              <w:t>, literatur internasional 50 sampai 100 cm</w:t>
             </w:r>
           </w:p>
         </w:tc>
@@ -9914,7 +10665,7 @@
               <w:rPr>
                 <w:sz w:val="18"/>
               </w:rPr>
-              <w:t>Tidak muncul di jawaban NotebookLM; cek halaman OSHA</w:t>
+              <w:t>Standar Indonesia diletakkan pertama; kedua angka dicatat</w:t>
             </w:r>
           </w:p>
         </w:tc>
@@ -9933,7 +10684,7 @@
               <w:rPr>
                 <w:sz w:val="18"/>
               </w:rPr>
-              <w:t>Angka tekanan intradiskal (Newton) dan lebar bebas 790 mm (ISO 14738)</w:t>
+              <w:t>Lampiran 6 tidak konsisten internal (persentil kursi di daftar pengantar vs Tabel B6.1; tinggi meja berdiri B4 vs Tabel B6.2)</w:t>
             </w:r>
           </w:p>
         </w:tc>
@@ -9950,7 +10701,7 @@
               <w:rPr>
                 <w:sz w:val="18"/>
               </w:rPr>
-              <w:t>Tidak dikutip karena tidak konsisten</w:t>
+              <w:t>Kedua versi dicatat, hafal isi tabel</w:t>
             </w:r>
           </w:p>
         </w:tc>
@@ -9969,7 +10720,7 @@
               <w:rPr>
                 <w:sz w:val="18"/>
               </w:rPr>
-              <w:t>Angka Oxenburgh (70%, RR 2,6), Onishi (30% MVC), Daniels, McConville &amp; Churchill</w:t>
+              <w:t>Rentang jarak LaDou ditulis "48 sampai 72 cm (20 sampai 30 inci)"</w:t>
             </w:r>
           </w:p>
         </w:tc>
@@ -9986,7 +10737,7 @@
               <w:rPr>
                 <w:sz w:val="18"/>
               </w:rPr>
-              <w:t>Dikutip dari jawaban NotebookLM atas Bodyspace; verifikasi bila perlu angka pasti</w:t>
+              <w:t>Konversi tidak cocok; dicatat</w:t>
             </w:r>
           </w:p>
         </w:tc>
@@ -10005,7 +10756,7 @@
               <w:rPr>
                 <w:sz w:val="18"/>
               </w:rPr>
-              <w:t>ROSA, REBA, RULA tidak ada di sumber</w:t>
+              <w:t>Rentang OSHA 50 sampai 100 cm (20 sampai 40 inci) dari outline</w:t>
             </w:r>
           </w:p>
         </w:tc>
@@ -10022,7 +10773,7 @@
               <w:rPr>
                 <w:sz w:val="18"/>
               </w:rPr>
-              <w:t>Baris ROSA dari pengetahuan umum penulis; ditandai</w:t>
+              <w:t>Tidak muncul di jawaban NotebookLM; cek halaman OSHA</w:t>
             </w:r>
           </w:p>
         </w:tc>
@@ -10041,7 +10792,7 @@
               <w:rPr>
                 <w:sz w:val="18"/>
               </w:rPr>
-              <w:t>Data antropometri Indonesia tidak ada di sumber</w:t>
+              <w:t>Angka tekanan intradiskal (Newton) dan lebar bebas 790 mm (ISO 14738)</w:t>
             </w:r>
           </w:p>
         </w:tc>
@@ -10058,7 +10809,7 @@
               <w:rPr>
                 <w:sz w:val="18"/>
               </w:rPr>
-              <w:t>Pencarian web hanya menemukan studi kecil; F6 tetap terbuka</w:t>
+              <w:t>Tidak dikutip karena tidak konsisten</w:t>
             </w:r>
           </w:p>
         </w:tc>
@@ -10077,7 +10828,7 @@
               <w:rPr>
                 <w:sz w:val="18"/>
               </w:rPr>
-              <w:t>Jawaban NotebookLM menyebut "ACGIH 2026" dan "Permenkes 11/2022" sebagai sumber ergonomi</w:t>
+              <w:t>Angka Oxenburgh (70%, RR 2,6), Onishi (30% MVC), Daniels, McConville &amp; Churchill</w:t>
             </w:r>
           </w:p>
         </w:tc>
@@ -10094,7 +10845,79 @@
               <w:rPr>
                 <w:sz w:val="18"/>
               </w:rPr>
-              <w:t>Hanya dipakai bila relevan; tidak ada angka dari keduanya dalam bab A</w:t>
+              <w:t>Dikutip dari jawaban NotebookLM atas Bodyspace; verifikasi bila perlu angka pasti</w:t>
+            </w:r>
+          </w:p>
+        </w:tc>
+      </w:tr>
+      <w:tr>
+        <w:tc>
+          <w:tcPr>
+            <w:tcW w:type="dxa" w:w="1701"/>
+          </w:tcPr>
+          <w:p>
+            <w:pPr>
+              <w:spacing w:after="0"/>
+            </w:pPr>
+            <w:r/>
+            <w:r>
+              <w:rPr>
+                <w:sz w:val="18"/>
+              </w:rPr>
+              <w:t>Data antropometri Indonesia tidak ada di sumber</w:t>
+            </w:r>
+          </w:p>
+        </w:tc>
+        <w:tc>
+          <w:tcPr>
+            <w:tcW w:type="dxa" w:w="8050"/>
+          </w:tcPr>
+          <w:p>
+            <w:pPr>
+              <w:spacing w:after="0"/>
+            </w:pPr>
+            <w:r/>
+            <w:r>
+              <w:rPr>
+                <w:sz w:val="18"/>
+              </w:rPr>
+              <w:t>Pencarian web hanya menemukan studi kecil; F6 tetap terbuka</w:t>
+            </w:r>
+          </w:p>
+        </w:tc>
+      </w:tr>
+      <w:tr>
+        <w:tc>
+          <w:tcPr>
+            <w:tcW w:type="dxa" w:w="1701"/>
+          </w:tcPr>
+          <w:p>
+            <w:pPr>
+              <w:spacing w:after="0"/>
+            </w:pPr>
+            <w:r/>
+            <w:r>
+              <w:rPr>
+                <w:sz w:val="18"/>
+              </w:rPr>
+              <w:t>Jawaban NotebookLM menyebut "ACGIH 2026" dan "Permenkes 11/2022" sebagai sumber ergonomi</w:t>
+            </w:r>
+          </w:p>
+        </w:tc>
+        <w:tc>
+          <w:tcPr>
+            <w:tcW w:type="dxa" w:w="8050"/>
+          </w:tcPr>
+          <w:p>
+            <w:pPr>
+              <w:spacing w:after="0"/>
+            </w:pPr>
+            <w:r/>
+            <w:r>
+              <w:rPr>
+                <w:sz w:val="18"/>
+              </w:rPr>
+              <w:t>Tidak ada angka dari keduanya dipakai dalam bab A</w:t>
             </w:r>
           </w:p>
         </w:tc>

</xml_diff>